<commit_message>
docs: update redesign prompt doc with LPIC+CSV encoding scheme
Adds Section 6 (LPIC+CSV lossless compression spec, dict building
algorithm, schema line format) and Section 14 (validation proof from
OpenAI o3 test — 100% lossless decode, ~92% token reduction).

https://claude.ai/code/session_01RHwr1AZxnjXc9QCLY7mFVG
</commit_message>
<xml_diff>
--- a/sessionmark_redesign_prompt.docx
+++ b/sessionmark_redesign_prompt.docx
@@ -88,9 +88,6 @@
       </w:r>
     </w:p>
     <w:p>
-      <w:pPr>
-        <w:spacing w:after="40"/>
-      </w:pPr>
       <w:r>
         <w:t>When sessionmark save is called, it should:</w:t>
       </w:r>
@@ -108,7 +105,7 @@
         <w:pStyle w:val="ListNumber"/>
       </w:pPr>
       <w:r>
-        <w:t>2. Write a rich context section directly into each installed agent config file, inside a clearly marked block:</w:t>
+        <w:t>2. Write a compressed context section directly into each installed agent config file, inside a clearly marked block (see Section 6 for encoding format):</w:t>
       </w:r>
     </w:p>
     <w:p>
@@ -136,7 +133,7 @@
           <w:rFonts w:ascii="Courier New" w:hAnsi="Courier New"/>
           <w:sz w:val="18"/>
         </w:rPr>
-        <w:t>... full briefing ...</w:t>
+        <w:t>... compressed session context ...</w:t>
       </w:r>
     </w:p>
     <w:p>
@@ -156,13 +153,10 @@
     <w:p/>
     <w:p>
       <w:r>
-        <w:t>When the user opens ANY agent in the same project directory, that agent reads its own config file at startup and sees the context section automatically. No trigger phrase needed. No resume command needed on the receiving end.</w:t>
+        <w:t>When the user opens ANY agent in the same project directory, that agent reads its own config file at startup and sees the context section automatically. No trigger phrase needed. No resume command needed on the receiving end. Context injection is invisible to the user.</w:t>
       </w:r>
     </w:p>
     <w:p>
-      <w:pPr>
-        <w:spacing w:after="40"/>
-      </w:pPr>
       <w:r>
         <w:t>When sessionmark resume &lt;name&gt; is called, it should:</w:t>
       </w:r>
@@ -172,7 +166,7 @@
         <w:pStyle w:val="ListNumber"/>
       </w:pPr>
       <w:r>
-        <w:t>1. Print the briefing as before</w:t>
+        <w:t>1. Print the full formatted briefing as before</w:t>
       </w:r>
     </w:p>
     <w:p>
@@ -180,7 +174,7 @@
         <w:pStyle w:val="ListNumber"/>
       </w:pPr>
       <w:r>
-        <w:t>2. Update the marked section in all installed config files to that session, so the next agent opened in this directory gets that session's context.</w:t>
+        <w:t>2. Update the compressed section in all installed config files to that session, so the next agent opened in this directory gets that session's context.</w:t>
       </w:r>
     </w:p>
     <w:p>
@@ -193,7 +187,7 @@
     </w:p>
     <w:p>
       <w:r>
-        <w:t>These are the verified project-local config files each agent reads unconditionally at startup:</w:t>
+        <w:t>These are the verified project-local config files each agent reads unconditionally at startup. All are project-scoped (live inside the repo directory), so context from project A never appears when opening an agent in project B.</w:t>
       </w:r>
     </w:p>
     <w:tbl>
@@ -284,7 +278,7 @@
               <w:rPr>
                 <w:sz w:val="18"/>
               </w:rPr>
-              <w:t>Append/update section; merges with global ~/.claude/CLAUDE.md</w:t>
+              <w:t>Append/update section; also reads global ~/.claude/CLAUDE.md</w:t>
             </w:r>
           </w:p>
         </w:tc>
@@ -340,6 +334,19 @@
               <w:rPr>
                 <w:sz w:val="18"/>
               </w:rPr>
+              <w:t>Cursor</w:t>
+            </w:r>
+          </w:p>
+        </w:tc>
+        <w:tc>
+          <w:tcPr>
+            <w:tcW w:type="dxa" w:w="2880"/>
+          </w:tcPr>
+          <w:p>
+            <w:r>
+              <w:rPr>
+                <w:sz w:val="18"/>
+              </w:rPr>
               <w:t>.cursor/rules/sessionmark.mdc</w:t>
             </w:r>
           </w:p>
@@ -353,20 +360,7 @@
               <w:rPr>
                 <w:sz w:val="18"/>
               </w:rPr>
-              <w:t>Cursor</w:t>
-            </w:r>
-          </w:p>
-        </w:tc>
-        <w:tc>
-          <w:tcPr>
-            <w:tcW w:type="dxa" w:w="2880"/>
-          </w:tcPr>
-          <w:p>
-            <w:r>
-              <w:rPr>
-                <w:sz w:val="18"/>
-              </w:rPr>
-              <w:t>Directory of .mdc files; .cursorrules is deprecated — do NOT use</w:t>
+              <w:t>.cursorrules is deprecated — do NOT use it</w:t>
             </w:r>
           </w:p>
         </w:tc>
@@ -407,7 +401,7 @@
               <w:rPr>
                 <w:sz w:val="18"/>
               </w:rPr>
-              <w:t>Works for both VS Code and JetBrains plugin</w:t>
+              <w:t>Works for VS Code and JetBrains plugin</w:t>
             </w:r>
           </w:p>
         </w:tc>
@@ -448,7 +442,7 @@
               <w:rPr>
                 <w:sz w:val="18"/>
               </w:rPr>
-              <w:t>Project-local; also has global ~/.windsurf/rules/ but ignore that</w:t>
+              <w:t>Project-local; ignore global ~/.windsurf/rules/</w:t>
             </w:r>
           </w:p>
         </w:tc>
@@ -489,7 +483,7 @@
               <w:rPr>
                 <w:sz w:val="18"/>
               </w:rPr>
-              <w:t>FULL OVERRIDE — must own the entire file, not just a section</w:t>
+              <w:t>FULL OVERRIDE — must own entire file contents</w:t>
             </w:r>
           </w:p>
         </w:tc>
@@ -506,12 +500,31 @@
         <w:pStyle w:val="Heading1"/>
       </w:pPr>
       <w:r>
-        <w:t>6. Context Section Content</w:t>
+        <w:t>6. Encoding: LPIC + CSV (Lossless, LLM-Decodable)</w:t>
       </w:r>
     </w:p>
     <w:p>
       <w:r>
-        <w:t>The section written into each config file should follow this template:</w:t>
+        <w:t>Context sections must be token-efficient. Use LPIC (Lossless Prompt Compression via Dictionary-Encoding and In-Context Learning, arxiv 2604.13066) combined with CSV-style field encoding. This has been manually validated against OpenAI o3 and ChatGPT — both chat decode and agentic auto-decode ("what are we working on?") work correctly with 100% lossless reconstruction.</w:t>
+      </w:r>
+    </w:p>
+    <w:p>
+      <w:r>
+        <w:t>Validated token savings: ~500 tokens (verbose markdown) → ~40 tokens (LPIC+CSV). ~92% reduction.</w:t>
+      </w:r>
+    </w:p>
+    <w:p/>
+    <w:p>
+      <w:pPr>
+        <w:pStyle w:val="Heading2"/>
+      </w:pPr>
+      <w:r>
+        <w:t>6.1 Schema Line (written once at install, never updated)</w:t>
+      </w:r>
+    </w:p>
+    <w:p>
+      <w:r>
+        <w:t>The schema line is written once when the user runs sessionmark install. It is permanent and never modified by save/resume.</w:t>
       </w:r>
     </w:p>
     <w:p>
@@ -525,7 +538,20 @@
           <w:rFonts w:ascii="Courier New" w:hAnsi="Courier New"/>
           <w:sz w:val="18"/>
         </w:rPr>
-        <w:t>&lt;!-- sessionmark:start --&gt;</w:t>
+        <w:t>&lt;!-- sessionmark-schema: fields sep=, lists sep=| bool=0/1 keys:n=name,g=goal,b=branch,r=repo,s=source,f=files,t=todos(done:text),c=commands. When you see a sessionmark block, expand all single-letter tokens using the dict before reading the session context. --&gt;</w:t>
+      </w:r>
+    </w:p>
+    <w:p>
+      <w:pPr>
+        <w:pStyle w:val="Heading2"/>
+      </w:pPr>
+      <w:r>
+        <w:t>6.2 Data Section (updated on every save/resume)</w:t>
+      </w:r>
+    </w:p>
+    <w:p>
+      <w:r>
+        <w:t>On every save or resume, update the content between the start/end markers. The dict contains repeated substrings replaced by single uppercase letters. Build the dict by finding the most frequent substrings (LZ77-style). Only include dict entries that produce a net token saving.</w:t>
       </w:r>
     </w:p>
     <w:p>
@@ -539,7 +565,295 @@
           <w:rFonts w:ascii="Courier New" w:hAnsi="Courier New"/>
           <w:sz w:val="18"/>
         </w:rPr>
-        <w:t>## Active session: &lt;name&gt;  (saved &lt;relative time&gt;)</w:t>
+        <w:t>&lt;!-- sessionmark:start</w:t>
+      </w:r>
+    </w:p>
+    <w:p>
+      <w:pPr>
+        <w:spacing w:before="0" w:after="0"/>
+        <w:ind w:left="432"/>
+        <w:shd w:val="clear" w:color="auto" w:fill="F2F2F2"/>
+      </w:pPr>
+      <w:r>
+        <w:rPr>
+          <w:rFonts w:ascii="Courier New" w:hAnsi="Courier New"/>
+          <w:sz w:val="18"/>
+        </w:rPr>
+        <w:t>dict:A=src/bookmark/,B=bookmark-cli,C=v0.1.0</w:t>
+      </w:r>
+    </w:p>
+    <w:p>
+      <w:pPr>
+        <w:spacing w:before="0" w:after="0"/>
+        <w:ind w:left="432"/>
+        <w:shd w:val="clear" w:color="auto" w:fill="F2F2F2"/>
+      </w:pPr>
+      <w:r>
+        <w:rPr>
+          <w:rFonts w:ascii="Courier New" w:hAnsi="Courier New"/>
+          <w:sz w:val="18"/>
+        </w:rPr>
+        <w:t>--&gt;</w:t>
+      </w:r>
+    </w:p>
+    <w:p>
+      <w:pPr>
+        <w:spacing w:before="0" w:after="0"/>
+        <w:ind w:left="432"/>
+        <w:shd w:val="clear" w:color="auto" w:fill="F2F2F2"/>
+      </w:pPr>
+      <w:r>
+        <w:rPr>
+          <w:rFonts w:ascii="Courier New" w:hAnsi="Courier New"/>
+          <w:sz w:val="18"/>
+        </w:rPr>
+        <w:t>n:B-build,g:Built B C — all 5 weeks of work,b:master,r:bookmark,s:claude-code,f:Acore/save.py|Astorage/db.py|Acli.py,t:0:publish to PyPI|0:write README|1:initial release,c:pytest tests/|ruff check src/|git tag C</w:t>
+      </w:r>
+    </w:p>
+    <w:p>
+      <w:pPr>
+        <w:spacing w:before="0" w:after="0"/>
+        <w:ind w:left="432"/>
+        <w:shd w:val="clear" w:color="auto" w:fill="F2F2F2"/>
+      </w:pPr>
+      <w:r>
+        <w:rPr>
+          <w:rFonts w:ascii="Courier New" w:hAnsi="Courier New"/>
+          <w:sz w:val="18"/>
+        </w:rPr>
+        <w:t>&lt;!-- sessionmark:end --&gt;</w:t>
+      </w:r>
+    </w:p>
+    <w:p>
+      <w:pPr>
+        <w:pStyle w:val="Heading2"/>
+      </w:pPr>
+      <w:r>
+        <w:t>6.3 Gemini Special Case</w:t>
+      </w:r>
+    </w:p>
+    <w:p>
+      <w:r>
+        <w:t>Gemini CLI's .gemini/system.md is a full system prompt override — sessionmark must own and manage the entire file. Structure it as a valid standalone system prompt with the compressed session section embedded at the end.</w:t>
+      </w:r>
+    </w:p>
+    <w:p>
+      <w:pPr>
+        <w:pStyle w:val="Heading2"/>
+      </w:pPr>
+      <w:r>
+        <w:t>6.4 Dict Building Algorithm</w:t>
+      </w:r>
+    </w:p>
+    <w:p>
+      <w:r>
+        <w:t>Implement in src/bookmark/install/context_writer.py:</w:t>
+      </w:r>
+    </w:p>
+    <w:p>
+      <w:pPr>
+        <w:pStyle w:val="ListBullet"/>
+      </w:pPr>
+      <w:r>
+        <w:t>Collect all string values from the session (goal, branch, repo, file paths, commands, todos)</w:t>
+      </w:r>
+    </w:p>
+    <w:p>
+      <w:pPr>
+        <w:pStyle w:val="ListBullet"/>
+      </w:pPr>
+      <w:r>
+        <w:t>Find substrings that appear 2+ times and are longer than 4 characters</w:t>
+      </w:r>
+    </w:p>
+    <w:p>
+      <w:pPr>
+        <w:pStyle w:val="ListBullet"/>
+      </w:pPr>
+      <w:r>
+        <w:t>Rank by (occurrences - 1) × len(substring) — net character saving</w:t>
+      </w:r>
+    </w:p>
+    <w:p>
+      <w:pPr>
+        <w:pStyle w:val="ListBullet"/>
+      </w:pPr>
+      <w:r>
+        <w:t>Assign single uppercase letters A, B, C... to top candidates</w:t>
+      </w:r>
+    </w:p>
+    <w:p>
+      <w:pPr>
+        <w:pStyle w:val="ListBullet"/>
+      </w:pPr>
+      <w:r>
+        <w:t>Only include entries where net saving &gt; len(key) + len('=') + len(value) + 1 (dict overhead)</w:t>
+      </w:r>
+    </w:p>
+    <w:p>
+      <w:pPr>
+        <w:pStyle w:val="ListBullet"/>
+      </w:pPr>
+      <w:r>
+        <w:t>Apply substitutions to the data string before writing</w:t>
+      </w:r>
+    </w:p>
+    <w:p>
+      <w:pPr>
+        <w:pStyle w:val="Heading1"/>
+      </w:pPr>
+      <w:r>
+        <w:t>7. install Command Changes</w:t>
+      </w:r>
+    </w:p>
+    <w:p>
+      <w:r>
+        <w:t>sessionmark install --for &lt;agent&gt; should:</w:t>
+      </w:r>
+    </w:p>
+    <w:p>
+      <w:pPr>
+        <w:pStyle w:val="ListBullet"/>
+      </w:pPr>
+      <w:r>
+        <w:t>Create the config file if it doesn't exist, writing the schema line + empty markers</w:t>
+      </w:r>
+    </w:p>
+    <w:p>
+      <w:pPr>
+        <w:pStyle w:val="ListBullet"/>
+      </w:pPr>
+      <w:r>
+        <w:t>If the file exists with no sessionmark section, append schema line + empty markers</w:t>
+      </w:r>
+    </w:p>
+    <w:p>
+      <w:pPr>
+        <w:pStyle w:val="ListBullet"/>
+      </w:pPr>
+      <w:r>
+        <w:t>If the file exists with sessionmark section already, leave it (idempotent)</w:t>
+      </w:r>
+    </w:p>
+    <w:p>
+      <w:pPr>
+        <w:pStyle w:val="ListBullet"/>
+      </w:pPr>
+      <w:r>
+        <w:t>Return {"action": "installed" | "already_installed" | "dry_run"}</w:t>
+      </w:r>
+    </w:p>
+    <w:p/>
+    <w:p>
+      <w:r>
+        <w:t>sessionmark install --for all installs for all 6 agents in Section 5.</w:t>
+      </w:r>
+    </w:p>
+    <w:p>
+      <w:r>
+        <w:t>Remove src/bookmark/skills/ directory and all per-agent skill template files. The installer no longer copies static skill files.</w:t>
+      </w:r>
+    </w:p>
+    <w:p>
+      <w:pPr>
+        <w:pStyle w:val="Heading1"/>
+      </w:pPr>
+      <w:r>
+        <w:t>8. save Command Changes</w:t>
+      </w:r>
+    </w:p>
+    <w:p>
+      <w:r>
+        <w:t>After the existing DB save logic in src/bookmark/core/save.py, call context_writer.update_all_installed(cwd, session) which:</w:t>
+      </w:r>
+    </w:p>
+    <w:p>
+      <w:pPr>
+        <w:pStyle w:val="ListBullet"/>
+      </w:pPr>
+      <w:r>
+        <w:t>Detects which config files from Section 5 are present in cwd</w:t>
+      </w:r>
+    </w:p>
+    <w:p>
+      <w:pPr>
+        <w:pStyle w:val="ListBullet"/>
+      </w:pPr>
+      <w:r>
+        <w:t>Builds the LPIC dict from the session data</w:t>
+      </w:r>
+    </w:p>
+    <w:p>
+      <w:pPr>
+        <w:pStyle w:val="ListBullet"/>
+      </w:pPr>
+      <w:r>
+        <w:t>Encodes the session as CSV with dict substitutions applied</w:t>
+      </w:r>
+    </w:p>
+    <w:p>
+      <w:pPr>
+        <w:pStyle w:val="ListBullet"/>
+      </w:pPr>
+      <w:r>
+        <w:t>Updates the &lt;!-- sessionmark:start --&gt; ... &lt;!-- sessionmark:end --&gt; section in each file</w:t>
+      </w:r>
+    </w:p>
+    <w:p>
+      <w:pPr>
+        <w:pStyle w:val="ListBullet"/>
+      </w:pPr>
+      <w:r>
+        <w:t>Skips silently if no config files are present (user hasn't run install yet)</w:t>
+      </w:r>
+    </w:p>
+    <w:p>
+      <w:pPr>
+        <w:pStyle w:val="Heading1"/>
+      </w:pPr>
+      <w:r>
+        <w:t>9. resume Command Changes</w:t>
+      </w:r>
+    </w:p>
+    <w:p>
+      <w:r>
+        <w:t>After generating the briefing in src/bookmark/core/resume.py, call the same context_writer.update_all_installed(cwd, session) to update all installed config files to the resumed session. Opening any agent after sessionmark resume &lt;name&gt; will automatically have that session's context.</w:t>
+      </w:r>
+    </w:p>
+    <w:p>
+      <w:pPr>
+        <w:pStyle w:val="Heading1"/>
+      </w:pPr>
+      <w:r>
+        <w:t>10. New Module: src/bookmark/install/context_writer.py</w:t>
+      </w:r>
+    </w:p>
+    <w:p>
+      <w:pPr>
+        <w:spacing w:before="0" w:after="0"/>
+        <w:ind w:left="432"/>
+        <w:shd w:val="clear" w:color="auto" w:fill="F2F2F2"/>
+      </w:pPr>
+      <w:r>
+        <w:rPr>
+          <w:rFonts w:ascii="Courier New" w:hAnsi="Courier New"/>
+          <w:sz w:val="18"/>
+        </w:rPr>
+        <w:t>from pathlib import Path</w:t>
+      </w:r>
+    </w:p>
+    <w:p>
+      <w:pPr>
+        <w:spacing w:before="0" w:after="0"/>
+        <w:ind w:left="432"/>
+        <w:shd w:val="clear" w:color="auto" w:fill="F2F2F2"/>
+      </w:pPr>
+      <w:r>
+        <w:rPr>
+          <w:rFonts w:ascii="Courier New" w:hAnsi="Courier New"/>
+          <w:sz w:val="18"/>
+        </w:rPr>
+        <w:t>from typing import Literal</w:t>
       </w:r>
     </w:p>
     <w:p>
@@ -567,7 +881,7 @@
           <w:rFonts w:ascii="Courier New" w:hAnsi="Courier New"/>
           <w:sz w:val="18"/>
         </w:rPr>
-        <w:t>**Goal:** &lt;goal&gt;</w:t>
+        <w:t># Map agent name -&gt; (relative path, write mode)</w:t>
       </w:r>
     </w:p>
     <w:p>
@@ -581,7 +895,7 @@
           <w:rFonts w:ascii="Courier New" w:hAnsi="Courier New"/>
           <w:sz w:val="18"/>
         </w:rPr>
-        <w:t>**Repo:** &lt;repo_name&gt; on &lt;git_branch&gt; @ &lt;git_head_short&gt;</w:t>
+        <w:t>CONFIG_FILES: dict[str, dict] = {</w:t>
       </w:r>
     </w:p>
     <w:p>
@@ -595,7 +909,91 @@
           <w:rFonts w:ascii="Courier New" w:hAnsi="Courier New"/>
           <w:sz w:val="18"/>
         </w:rPr>
-        <w:t>**Saved from:** &lt;source agent&gt;</w:t>
+        <w:t xml:space="preserve">    "claude-code":    {"path": "CLAUDE.md",                        "mode": "append_section"},</w:t>
+      </w:r>
+    </w:p>
+    <w:p>
+      <w:pPr>
+        <w:spacing w:before="0" w:after="0"/>
+        <w:ind w:left="432"/>
+        <w:shd w:val="clear" w:color="auto" w:fill="F2F2F2"/>
+      </w:pPr>
+      <w:r>
+        <w:rPr>
+          <w:rFonts w:ascii="Courier New" w:hAnsi="Courier New"/>
+          <w:sz w:val="18"/>
+        </w:rPr>
+        <w:t xml:space="preserve">    "codex":          {"path": "AGENTS.md",                        "mode": "append_section"},</w:t>
+      </w:r>
+    </w:p>
+    <w:p>
+      <w:pPr>
+        <w:spacing w:before="0" w:after="0"/>
+        <w:ind w:left="432"/>
+        <w:shd w:val="clear" w:color="auto" w:fill="F2F2F2"/>
+      </w:pPr>
+      <w:r>
+        <w:rPr>
+          <w:rFonts w:ascii="Courier New" w:hAnsi="Courier New"/>
+          <w:sz w:val="18"/>
+        </w:rPr>
+        <w:t xml:space="preserve">    "cursor":         {"path": ".cursor/rules/sessionmark.mdc",    "mode": "append_section"},</w:t>
+      </w:r>
+    </w:p>
+    <w:p>
+      <w:pPr>
+        <w:spacing w:before="0" w:after="0"/>
+        <w:ind w:left="432"/>
+        <w:shd w:val="clear" w:color="auto" w:fill="F2F2F2"/>
+      </w:pPr>
+      <w:r>
+        <w:rPr>
+          <w:rFonts w:ascii="Courier New" w:hAnsi="Courier New"/>
+          <w:sz w:val="18"/>
+        </w:rPr>
+        <w:t xml:space="preserve">    "github-copilot": {"path": ".github/copilot-instructions.md",  "mode": "append_section"},</w:t>
+      </w:r>
+    </w:p>
+    <w:p>
+      <w:pPr>
+        <w:spacing w:before="0" w:after="0"/>
+        <w:ind w:left="432"/>
+        <w:shd w:val="clear" w:color="auto" w:fill="F2F2F2"/>
+      </w:pPr>
+      <w:r>
+        <w:rPr>
+          <w:rFonts w:ascii="Courier New" w:hAnsi="Courier New"/>
+          <w:sz w:val="18"/>
+        </w:rPr>
+        <w:t xml:space="preserve">    "windsurf":       {"path": ".windsurf/rules/sessionmark.md",   "mode": "append_section"},</w:t>
+      </w:r>
+    </w:p>
+    <w:p>
+      <w:pPr>
+        <w:spacing w:before="0" w:after="0"/>
+        <w:ind w:left="432"/>
+        <w:shd w:val="clear" w:color="auto" w:fill="F2F2F2"/>
+      </w:pPr>
+      <w:r>
+        <w:rPr>
+          <w:rFonts w:ascii="Courier New" w:hAnsi="Courier New"/>
+          <w:sz w:val="18"/>
+        </w:rPr>
+        <w:t xml:space="preserve">    "gemini":         {"path": ".gemini/system.md",                "mode": "full_override"},</w:t>
+      </w:r>
+    </w:p>
+    <w:p>
+      <w:pPr>
+        <w:spacing w:before="0" w:after="0"/>
+        <w:ind w:left="432"/>
+        <w:shd w:val="clear" w:color="auto" w:fill="F2F2F2"/>
+      </w:pPr>
+      <w:r>
+        <w:rPr>
+          <w:rFonts w:ascii="Courier New" w:hAnsi="Courier New"/>
+          <w:sz w:val="18"/>
+        </w:rPr>
+        <w:t>}</w:t>
       </w:r>
     </w:p>
     <w:p>
@@ -623,7 +1021,7 @@
           <w:rFonts w:ascii="Courier New" w:hAnsi="Courier New"/>
           <w:sz w:val="18"/>
         </w:rPr>
-        <w:t>### Last exchange</w:t>
+        <w:t>SCHEMA_LINE = (</w:t>
       </w:r>
     </w:p>
     <w:p>
@@ -637,7 +1035,77 @@
           <w:rFonts w:ascii="Courier New" w:hAnsi="Courier New"/>
           <w:sz w:val="18"/>
         </w:rPr>
-        <w:t>&lt;last 6 transcript messages as human-readable dialogue&gt;</w:t>
+        <w:t xml:space="preserve">    "&lt;!-- sessionmark-schema: fields sep=, lists sep=| bool=0/1 "</w:t>
+      </w:r>
+    </w:p>
+    <w:p>
+      <w:pPr>
+        <w:spacing w:before="0" w:after="0"/>
+        <w:ind w:left="432"/>
+        <w:shd w:val="clear" w:color="auto" w:fill="F2F2F2"/>
+      </w:pPr>
+      <w:r>
+        <w:rPr>
+          <w:rFonts w:ascii="Courier New" w:hAnsi="Courier New"/>
+          <w:sz w:val="18"/>
+        </w:rPr>
+        <w:t xml:space="preserve">    "keys:n=name,g=goal,b=branch,r=repo,s=source,f=files,"</w:t>
+      </w:r>
+    </w:p>
+    <w:p>
+      <w:pPr>
+        <w:spacing w:before="0" w:after="0"/>
+        <w:ind w:left="432"/>
+        <w:shd w:val="clear" w:color="auto" w:fill="F2F2F2"/>
+      </w:pPr>
+      <w:r>
+        <w:rPr>
+          <w:rFonts w:ascii="Courier New" w:hAnsi="Courier New"/>
+          <w:sz w:val="18"/>
+        </w:rPr>
+        <w:t xml:space="preserve">    "t=todos(done:text),c=commands. "</w:t>
+      </w:r>
+    </w:p>
+    <w:p>
+      <w:pPr>
+        <w:spacing w:before="0" w:after="0"/>
+        <w:ind w:left="432"/>
+        <w:shd w:val="clear" w:color="auto" w:fill="F2F2F2"/>
+      </w:pPr>
+      <w:r>
+        <w:rPr>
+          <w:rFonts w:ascii="Courier New" w:hAnsi="Courier New"/>
+          <w:sz w:val="18"/>
+        </w:rPr>
+        <w:t xml:space="preserve">    "When you see a sessionmark block, expand all single-letter tokens "</w:t>
+      </w:r>
+    </w:p>
+    <w:p>
+      <w:pPr>
+        <w:spacing w:before="0" w:after="0"/>
+        <w:ind w:left="432"/>
+        <w:shd w:val="clear" w:color="auto" w:fill="F2F2F2"/>
+      </w:pPr>
+      <w:r>
+        <w:rPr>
+          <w:rFonts w:ascii="Courier New" w:hAnsi="Courier New"/>
+          <w:sz w:val="18"/>
+        </w:rPr>
+        <w:t xml:space="preserve">    "using the dict before reading the session context. --&gt;"</w:t>
+      </w:r>
+    </w:p>
+    <w:p>
+      <w:pPr>
+        <w:spacing w:before="0" w:after="0"/>
+        <w:ind w:left="432"/>
+        <w:shd w:val="clear" w:color="auto" w:fill="F2F2F2"/>
+      </w:pPr>
+      <w:r>
+        <w:rPr>
+          <w:rFonts w:ascii="Courier New" w:hAnsi="Courier New"/>
+          <w:sz w:val="18"/>
+        </w:rPr>
+        <w:t>)</w:t>
       </w:r>
     </w:p>
     <w:p>
@@ -665,7 +1133,7 @@
           <w:rFonts w:ascii="Courier New" w:hAnsi="Courier New"/>
           <w:sz w:val="18"/>
         </w:rPr>
-        <w:t>### Commands run</w:t>
+        <w:t>def build_dict(session_str: str) -&gt; dict[str, str]:</w:t>
       </w:r>
     </w:p>
     <w:p>
@@ -679,7 +1147,21 @@
           <w:rFonts w:ascii="Courier New" w:hAnsi="Courier New"/>
           <w:sz w:val="18"/>
         </w:rPr>
-        <w:t>&lt;bash commands extracted from transcript tool calls, deduplicated&gt;</w:t>
+        <w:t xml:space="preserve">    """Find repeated substrings and return substitution map A-&gt;substring."""</w:t>
+      </w:r>
+    </w:p>
+    <w:p>
+      <w:pPr>
+        <w:spacing w:before="0" w:after="0"/>
+        <w:ind w:left="432"/>
+        <w:shd w:val="clear" w:color="auto" w:fill="F2F2F2"/>
+      </w:pPr>
+      <w:r>
+        <w:rPr>
+          <w:rFonts w:ascii="Courier New" w:hAnsi="Courier New"/>
+          <w:sz w:val="18"/>
+        </w:rPr>
+        <w:t xml:space="preserve">    ...</w:t>
       </w:r>
     </w:p>
     <w:p>
@@ -707,7 +1189,7 @@
           <w:rFonts w:ascii="Courier New" w:hAnsi="Courier New"/>
           <w:sz w:val="18"/>
         </w:rPr>
-        <w:t>### MCP tools used</w:t>
+        <w:t>def encode_session(session: dict, sub_dict: dict[str, str]) -&gt; str:</w:t>
       </w:r>
     </w:p>
     <w:p>
@@ -721,7 +1203,21 @@
           <w:rFonts w:ascii="Courier New" w:hAnsi="Courier New"/>
           <w:sz w:val="18"/>
         </w:rPr>
-        <w:t>&lt;mcp tool calls extracted from transcript, with args summary&gt;</w:t>
+        <w:t xml:space="preserve">    """Encode session as CSV line with dict substitutions applied."""</w:t>
+      </w:r>
+    </w:p>
+    <w:p>
+      <w:pPr>
+        <w:spacing w:before="0" w:after="0"/>
+        <w:ind w:left="432"/>
+        <w:shd w:val="clear" w:color="auto" w:fill="F2F2F2"/>
+      </w:pPr>
+      <w:r>
+        <w:rPr>
+          <w:rFonts w:ascii="Courier New" w:hAnsi="Courier New"/>
+          <w:sz w:val="18"/>
+        </w:rPr>
+        <w:t xml:space="preserve">    ...</w:t>
       </w:r>
     </w:p>
     <w:p>
@@ -749,7 +1245,7 @@
           <w:rFonts w:ascii="Courier New" w:hAnsi="Courier New"/>
           <w:sz w:val="18"/>
         </w:rPr>
-        <w:t>### Open files</w:t>
+        <w:t>def update_context_section(</w:t>
       </w:r>
     </w:p>
     <w:p>
@@ -763,7 +1259,77 @@
           <w:rFonts w:ascii="Courier New" w:hAnsi="Courier New"/>
           <w:sz w:val="18"/>
         </w:rPr>
-        <w:t>&lt;M/A/D  path  +lines -lines&gt;</w:t>
+        <w:t xml:space="preserve">    config_file: Path,</w:t>
+      </w:r>
+    </w:p>
+    <w:p>
+      <w:pPr>
+        <w:spacing w:before="0" w:after="0"/>
+        <w:ind w:left="432"/>
+        <w:shd w:val="clear" w:color="auto" w:fill="F2F2F2"/>
+      </w:pPr>
+      <w:r>
+        <w:rPr>
+          <w:rFonts w:ascii="Courier New" w:hAnsi="Courier New"/>
+          <w:sz w:val="18"/>
+        </w:rPr>
+        <w:t xml:space="preserve">    compressed: str,</w:t>
+      </w:r>
+    </w:p>
+    <w:p>
+      <w:pPr>
+        <w:spacing w:before="0" w:after="0"/>
+        <w:ind w:left="432"/>
+        <w:shd w:val="clear" w:color="auto" w:fill="F2F2F2"/>
+      </w:pPr>
+      <w:r>
+        <w:rPr>
+          <w:rFonts w:ascii="Courier New" w:hAnsi="Courier New"/>
+          <w:sz w:val="18"/>
+        </w:rPr>
+        <w:t xml:space="preserve">    mode: Literal["append_section", "full_override"],</w:t>
+      </w:r>
+    </w:p>
+    <w:p>
+      <w:pPr>
+        <w:spacing w:before="0" w:after="0"/>
+        <w:ind w:left="432"/>
+        <w:shd w:val="clear" w:color="auto" w:fill="F2F2F2"/>
+      </w:pPr>
+      <w:r>
+        <w:rPr>
+          <w:rFonts w:ascii="Courier New" w:hAnsi="Courier New"/>
+          <w:sz w:val="18"/>
+        </w:rPr>
+        <w:t>) -&gt; bool:</w:t>
+      </w:r>
+    </w:p>
+    <w:p>
+      <w:pPr>
+        <w:spacing w:before="0" w:after="0"/>
+        <w:ind w:left="432"/>
+        <w:shd w:val="clear" w:color="auto" w:fill="F2F2F2"/>
+      </w:pPr>
+      <w:r>
+        <w:rPr>
+          <w:rFonts w:ascii="Courier New" w:hAnsi="Courier New"/>
+          <w:sz w:val="18"/>
+        </w:rPr>
+        <w:t xml:space="preserve">    """Replace sessionmark section in config file. Returns True if modified."""</w:t>
+      </w:r>
+    </w:p>
+    <w:p>
+      <w:pPr>
+        <w:spacing w:before="0" w:after="0"/>
+        <w:ind w:left="432"/>
+        <w:shd w:val="clear" w:color="auto" w:fill="F2F2F2"/>
+      </w:pPr>
+      <w:r>
+        <w:rPr>
+          <w:rFonts w:ascii="Courier New" w:hAnsi="Courier New"/>
+          <w:sz w:val="18"/>
+        </w:rPr>
+        <w:t xml:space="preserve">    ...</w:t>
       </w:r>
     </w:p>
     <w:p>
@@ -791,7 +1357,7 @@
           <w:rFonts w:ascii="Courier New" w:hAnsi="Courier New"/>
           <w:sz w:val="18"/>
         </w:rPr>
-        <w:t>### TODOs</w:t>
+        <w:t>def install_section(config_file: Path) -&gt; Literal["installed", "already_installed"]:</w:t>
       </w:r>
     </w:p>
     <w:p>
@@ -805,7 +1371,21 @@
           <w:rFonts w:ascii="Courier New" w:hAnsi="Courier New"/>
           <w:sz w:val="18"/>
         </w:rPr>
-        <w:t>&lt;[ ] or [x]  text&gt;</w:t>
+        <w:t xml:space="preserve">    """Write schema line + empty markers to config file (idempotent)."""</w:t>
+      </w:r>
+    </w:p>
+    <w:p>
+      <w:pPr>
+        <w:spacing w:before="0" w:after="0"/>
+        <w:ind w:left="432"/>
+        <w:shd w:val="clear" w:color="auto" w:fill="F2F2F2"/>
+      </w:pPr>
+      <w:r>
+        <w:rPr>
+          <w:rFonts w:ascii="Courier New" w:hAnsi="Courier New"/>
+          <w:sz w:val="18"/>
+        </w:rPr>
+        <w:t xml:space="preserve">    ...</w:t>
       </w:r>
     </w:p>
     <w:p>
@@ -833,7 +1413,7 @@
           <w:rFonts w:ascii="Courier New" w:hAnsi="Courier New"/>
           <w:sz w:val="18"/>
         </w:rPr>
-        <w:t>### Next step</w:t>
+        <w:t>def update_all_installed(cwd: Path, session: dict) -&gt; list[Path]:</w:t>
       </w:r>
     </w:p>
     <w:p>
@@ -847,7 +1427,21 @@
           <w:rFonts w:ascii="Courier New" w:hAnsi="Courier New"/>
           <w:sz w:val="18"/>
         </w:rPr>
-        <w:t>cd &lt;repo_root&gt; &amp;&amp; git checkout &lt;branch&gt;</w:t>
+        <w:t xml:space="preserve">    """Update sessionmark sections in all config files present in cwd."""</w:t>
+      </w:r>
+    </w:p>
+    <w:p>
+      <w:pPr>
+        <w:spacing w:before="0" w:after="0"/>
+        <w:ind w:left="432"/>
+        <w:shd w:val="clear" w:color="auto" w:fill="F2F2F2"/>
+      </w:pPr>
+      <w:r>
+        <w:rPr>
+          <w:rFonts w:ascii="Courier New" w:hAnsi="Courier New"/>
+          <w:sz w:val="18"/>
+        </w:rPr>
+        <w:t xml:space="preserve">    ...</w:t>
       </w:r>
     </w:p>
     <w:p>
@@ -875,361 +1469,6 @@
           <w:rFonts w:ascii="Courier New" w:hAnsi="Courier New"/>
           <w:sz w:val="18"/>
         </w:rPr>
-        <w:t>---</w:t>
-      </w:r>
-    </w:p>
-    <w:p>
-      <w:pPr>
-        <w:spacing w:before="0" w:after="0"/>
-        <w:ind w:left="432"/>
-        <w:shd w:val="clear" w:color="auto" w:fill="F2F2F2"/>
-      </w:pPr>
-      <w:r>
-        <w:rPr>
-          <w:rFonts w:ascii="Courier New" w:hAnsi="Courier New"/>
-          <w:sz w:val="18"/>
-        </w:rPr>
-        <w:t>*To load a different session: `sessionmark resume &lt;name&gt;`*</w:t>
-      </w:r>
-    </w:p>
-    <w:p>
-      <w:pPr>
-        <w:spacing w:before="0" w:after="0"/>
-        <w:ind w:left="432"/>
-        <w:shd w:val="clear" w:color="auto" w:fill="F2F2F2"/>
-      </w:pPr>
-      <w:r>
-        <w:rPr>
-          <w:rFonts w:ascii="Courier New" w:hAnsi="Courier New"/>
-          <w:sz w:val="18"/>
-        </w:rPr>
-        <w:t>*To save current state: `sessionmark save -m "&lt;goal&gt;"`*</w:t>
-      </w:r>
-    </w:p>
-    <w:p>
-      <w:pPr>
-        <w:spacing w:before="0" w:after="0"/>
-        <w:ind w:left="432"/>
-        <w:shd w:val="clear" w:color="auto" w:fill="F2F2F2"/>
-      </w:pPr>
-      <w:r>
-        <w:rPr>
-          <w:rFonts w:ascii="Courier New" w:hAnsi="Courier New"/>
-          <w:sz w:val="18"/>
-        </w:rPr>
-        <w:t>&lt;!-- sessionmark:end --&gt;</w:t>
-      </w:r>
-    </w:p>
-    <w:p/>
-    <w:p>
-      <w:r>
-        <w:t>For Gemini (full-override mode): wrap the section in a complete standalone system prompt. The entire .gemini/system.md file is the system prompt, so sessionmark must own and manage the full file contents.</w:t>
-      </w:r>
-    </w:p>
-    <w:p>
-      <w:pPr>
-        <w:pStyle w:val="Heading1"/>
-      </w:pPr>
-      <w:r>
-        <w:t>7. install Command Changes</w:t>
-      </w:r>
-    </w:p>
-    <w:p>
-      <w:pPr>
-        <w:spacing w:after="40"/>
-      </w:pPr>
-      <w:r>
-        <w:t>sessionmark install --for &lt;agent&gt; should:</w:t>
-      </w:r>
-    </w:p>
-    <w:p>
-      <w:pPr>
-        <w:pStyle w:val="ListBullet"/>
-      </w:pPr>
-      <w:r>
-        <w:t>Create the config file if it doesn't exist (with just the empty marked section)</w:t>
-      </w:r>
-    </w:p>
-    <w:p>
-      <w:pPr>
-        <w:pStyle w:val="ListBullet"/>
-      </w:pPr>
-      <w:r>
-        <w:t>If the file already exists and has no sessionmark section, append the empty section</w:t>
-      </w:r>
-    </w:p>
-    <w:p>
-      <w:pPr>
-        <w:pStyle w:val="ListBullet"/>
-      </w:pPr>
-      <w:r>
-        <w:t>If the file already exists and already has a sessionmark section, leave it (idempotent)</w:t>
-      </w:r>
-    </w:p>
-    <w:p>
-      <w:pPr>
-        <w:pStyle w:val="ListBullet"/>
-      </w:pPr>
-      <w:r>
-        <w:t>Return {"action": "installed" | "already_installed" | "dry_run"}</w:t>
-      </w:r>
-    </w:p>
-    <w:p/>
-    <w:p>
-      <w:r>
-        <w:t>sessionmark install --for all installs for all 6 agents listed in Section 5.</w:t>
-      </w:r>
-    </w:p>
-    <w:p>
-      <w:r>
-        <w:t>The old src/bookmark/skills/ directory and per-agent skill template files should be removed. The installer no longer copies static skill files — it manages live sections in the project's own config files.</w:t>
-      </w:r>
-    </w:p>
-    <w:p>
-      <w:pPr>
-        <w:pStyle w:val="Heading1"/>
-      </w:pPr>
-      <w:r>
-        <w:t>8. save Command Changes</w:t>
-      </w:r>
-    </w:p>
-    <w:p>
-      <w:pPr>
-        <w:spacing w:after="40"/>
-      </w:pPr>
-      <w:r>
-        <w:t>After the existing DB save logic in src/bookmark/core/save.py, add a call to a new module src/bookmark/install/context_writer.py that:</w:t>
-      </w:r>
-    </w:p>
-    <w:p>
-      <w:pPr>
-        <w:pStyle w:val="ListBullet"/>
-      </w:pPr>
-      <w:r>
-        <w:t>Detects which config files are present in cwd (don't write to files that don't exist — user must run install first)</w:t>
-      </w:r>
-    </w:p>
-    <w:p>
-      <w:pPr>
-        <w:pStyle w:val="ListBullet"/>
-      </w:pPr>
-      <w:r>
-        <w:t>Updates the sessionmark section in each found file with the new briefing</w:t>
-      </w:r>
-    </w:p>
-    <w:p>
-      <w:pPr>
-        <w:pStyle w:val="ListBullet"/>
-      </w:pPr>
-      <w:r>
-        <w:t>Skips silently if no config files are installed</w:t>
-      </w:r>
-    </w:p>
-    <w:p>
-      <w:pPr>
-        <w:pStyle w:val="Heading1"/>
-      </w:pPr>
-      <w:r>
-        <w:t>9. resume Command Changes</w:t>
-      </w:r>
-    </w:p>
-    <w:p>
-      <w:r>
-        <w:t>After generating the briefing in src/bookmark/core/resume.py, call the same context_writer to update all installed config files to the resumed session. This means opening a new agent after sessionmark resume &lt;name&gt; will automatically have that session's context.</w:t>
-      </w:r>
-    </w:p>
-    <w:p>
-      <w:pPr>
-        <w:pStyle w:val="Heading1"/>
-      </w:pPr>
-      <w:r>
-        <w:t>10. New Module: src/bookmark/install/context_writer.py</w:t>
-      </w:r>
-    </w:p>
-    <w:p>
-      <w:r>
-        <w:t>Implement the following public interface:</w:t>
-      </w:r>
-    </w:p>
-    <w:p>
-      <w:pPr>
-        <w:spacing w:before="0" w:after="0"/>
-        <w:ind w:left="432"/>
-        <w:shd w:val="clear" w:color="auto" w:fill="F2F2F2"/>
-      </w:pPr>
-      <w:r>
-        <w:rPr>
-          <w:rFonts w:ascii="Courier New" w:hAnsi="Courier New"/>
-          <w:sz w:val="18"/>
-        </w:rPr>
-        <w:t>def update_context_section(</w:t>
-      </w:r>
-    </w:p>
-    <w:p>
-      <w:pPr>
-        <w:spacing w:before="0" w:after="0"/>
-        <w:ind w:left="432"/>
-        <w:shd w:val="clear" w:color="auto" w:fill="F2F2F2"/>
-      </w:pPr>
-      <w:r>
-        <w:rPr>
-          <w:rFonts w:ascii="Courier New" w:hAnsi="Courier New"/>
-          <w:sz w:val="18"/>
-        </w:rPr>
-        <w:t xml:space="preserve">    config_file: Path,</w:t>
-      </w:r>
-    </w:p>
-    <w:p>
-      <w:pPr>
-        <w:spacing w:before="0" w:after="0"/>
-        <w:ind w:left="432"/>
-        <w:shd w:val="clear" w:color="auto" w:fill="F2F2F2"/>
-      </w:pPr>
-      <w:r>
-        <w:rPr>
-          <w:rFonts w:ascii="Courier New" w:hAnsi="Courier New"/>
-          <w:sz w:val="18"/>
-        </w:rPr>
-        <w:t xml:space="preserve">    content: str,</w:t>
-      </w:r>
-    </w:p>
-    <w:p>
-      <w:pPr>
-        <w:spacing w:before="0" w:after="0"/>
-        <w:ind w:left="432"/>
-        <w:shd w:val="clear" w:color="auto" w:fill="F2F2F2"/>
-      </w:pPr>
-      <w:r>
-        <w:rPr>
-          <w:rFonts w:ascii="Courier New" w:hAnsi="Courier New"/>
-          <w:sz w:val="18"/>
-        </w:rPr>
-        <w:t xml:space="preserve">    mode: Literal["append_section", "full_override"],</w:t>
-      </w:r>
-    </w:p>
-    <w:p>
-      <w:pPr>
-        <w:spacing w:before="0" w:after="0"/>
-        <w:ind w:left="432"/>
-        <w:shd w:val="clear" w:color="auto" w:fill="F2F2F2"/>
-      </w:pPr>
-      <w:r>
-        <w:rPr>
-          <w:rFonts w:ascii="Courier New" w:hAnsi="Courier New"/>
-          <w:sz w:val="18"/>
-        </w:rPr>
-        <w:t>) -&gt; bool:</w:t>
-      </w:r>
-    </w:p>
-    <w:p>
-      <w:pPr>
-        <w:spacing w:before="0" w:after="0"/>
-        <w:ind w:left="432"/>
-        <w:shd w:val="clear" w:color="auto" w:fill="F2F2F2"/>
-      </w:pPr>
-      <w:r>
-        <w:rPr>
-          <w:rFonts w:ascii="Courier New" w:hAnsi="Courier New"/>
-          <w:sz w:val="18"/>
-        </w:rPr>
-        <w:t xml:space="preserve">    """Write/update the sessionmark section in a config file.</w:t>
-      </w:r>
-    </w:p>
-    <w:p>
-      <w:pPr>
-        <w:spacing w:before="0" w:after="0"/>
-        <w:ind w:left="432"/>
-        <w:shd w:val="clear" w:color="auto" w:fill="F2F2F2"/>
-      </w:pPr>
-      <w:r>
-        <w:rPr>
-          <w:rFonts w:ascii="Courier New" w:hAnsi="Courier New"/>
-          <w:sz w:val="18"/>
-        </w:rPr>
-        <w:t xml:space="preserve">    Returns True if the file was modified."""</w:t>
-      </w:r>
-    </w:p>
-    <w:p>
-      <w:pPr>
-        <w:spacing w:before="0" w:after="0"/>
-        <w:ind w:left="432"/>
-        <w:shd w:val="clear" w:color="auto" w:fill="F2F2F2"/>
-      </w:pPr>
-      <w:r>
-        <w:rPr>
-          <w:rFonts w:ascii="Courier New" w:hAnsi="Courier New"/>
-          <w:sz w:val="18"/>
-        </w:rPr>
-        <w:t xml:space="preserve"> </w:t>
-      </w:r>
-    </w:p>
-    <w:p>
-      <w:pPr>
-        <w:spacing w:before="0" w:after="0"/>
-        <w:ind w:left="432"/>
-        <w:shd w:val="clear" w:color="auto" w:fill="F2F2F2"/>
-      </w:pPr>
-      <w:r>
-        <w:rPr>
-          <w:rFonts w:ascii="Courier New" w:hAnsi="Courier New"/>
-          <w:sz w:val="18"/>
-        </w:rPr>
-        <w:t>def update_all_installed(cwd: Path, briefing: str) -&gt; list[Path]:</w:t>
-      </w:r>
-    </w:p>
-    <w:p>
-      <w:pPr>
-        <w:spacing w:before="0" w:after="0"/>
-        <w:ind w:left="432"/>
-        <w:shd w:val="clear" w:color="auto" w:fill="F2F2F2"/>
-      </w:pPr>
-      <w:r>
-        <w:rPr>
-          <w:rFonts w:ascii="Courier New" w:hAnsi="Courier New"/>
-          <w:sz w:val="18"/>
-        </w:rPr>
-        <w:t xml:space="preserve">    """Update sessionmark sections in all config files present in cwd.</w:t>
-      </w:r>
-    </w:p>
-    <w:p>
-      <w:pPr>
-        <w:spacing w:before="0" w:after="0"/>
-        <w:ind w:left="432"/>
-        <w:shd w:val="clear" w:color="auto" w:fill="F2F2F2"/>
-      </w:pPr>
-      <w:r>
-        <w:rPr>
-          <w:rFonts w:ascii="Courier New" w:hAnsi="Courier New"/>
-          <w:sz w:val="18"/>
-        </w:rPr>
-        <w:t xml:space="preserve">    Returns list of files updated."""</w:t>
-      </w:r>
-    </w:p>
-    <w:p>
-      <w:pPr>
-        <w:spacing w:before="0" w:after="0"/>
-        <w:ind w:left="432"/>
-        <w:shd w:val="clear" w:color="auto" w:fill="F2F2F2"/>
-      </w:pPr>
-      <w:r>
-        <w:rPr>
-          <w:rFonts w:ascii="Courier New" w:hAnsi="Courier New"/>
-          <w:sz w:val="18"/>
-        </w:rPr>
-        <w:t xml:space="preserve"> </w:t>
-      </w:r>
-    </w:p>
-    <w:p>
-      <w:pPr>
-        <w:spacing w:before="0" w:after="0"/>
-        <w:ind w:left="432"/>
-        <w:shd w:val="clear" w:color="auto" w:fill="F2F2F2"/>
-      </w:pPr>
-      <w:r>
-        <w:rPr>
-          <w:rFonts w:ascii="Courier New" w:hAnsi="Courier New"/>
-          <w:sz w:val="18"/>
-        </w:rPr>
         <w:t>def clear_section(config_file: Path) -&gt; bool:</w:t>
       </w:r>
     </w:p>
@@ -1258,119 +1497,7 @@
           <w:rFonts w:ascii="Courier New" w:hAnsi="Courier New"/>
           <w:sz w:val="18"/>
         </w:rPr>
-        <w:t xml:space="preserve"> </w:t>
-      </w:r>
-    </w:p>
-    <w:p>
-      <w:pPr>
-        <w:spacing w:before="0" w:after="0"/>
-        <w:ind w:left="432"/>
-        <w:shd w:val="clear" w:color="auto" w:fill="F2F2F2"/>
-      </w:pPr>
-      <w:r>
-        <w:rPr>
-          <w:rFonts w:ascii="Courier New" w:hAnsi="Courier New"/>
-          <w:sz w:val="18"/>
-        </w:rPr>
-        <w:t>CONFIG_FILES: dict[str, dict] = {</w:t>
-      </w:r>
-    </w:p>
-    <w:p>
-      <w:pPr>
-        <w:spacing w:before="0" w:after="0"/>
-        <w:ind w:left="432"/>
-        <w:shd w:val="clear" w:color="auto" w:fill="F2F2F2"/>
-      </w:pPr>
-      <w:r>
-        <w:rPr>
-          <w:rFonts w:ascii="Courier New" w:hAnsi="Courier New"/>
-          <w:sz w:val="18"/>
-        </w:rPr>
-        <w:t xml:space="preserve">    "claude-code":       {"path": "CLAUDE.md",                          "mode": "append_section"},</w:t>
-      </w:r>
-    </w:p>
-    <w:p>
-      <w:pPr>
-        <w:spacing w:before="0" w:after="0"/>
-        <w:ind w:left="432"/>
-        <w:shd w:val="clear" w:color="auto" w:fill="F2F2F2"/>
-      </w:pPr>
-      <w:r>
-        <w:rPr>
-          <w:rFonts w:ascii="Courier New" w:hAnsi="Courier New"/>
-          <w:sz w:val="18"/>
-        </w:rPr>
-        <w:t xml:space="preserve">    "codex":             {"path": "AGENTS.md",                          "mode": "append_section"},</w:t>
-      </w:r>
-    </w:p>
-    <w:p>
-      <w:pPr>
-        <w:spacing w:before="0" w:after="0"/>
-        <w:ind w:left="432"/>
-        <w:shd w:val="clear" w:color="auto" w:fill="F2F2F2"/>
-      </w:pPr>
-      <w:r>
-        <w:rPr>
-          <w:rFonts w:ascii="Courier New" w:hAnsi="Courier New"/>
-          <w:sz w:val="18"/>
-        </w:rPr>
-        <w:t xml:space="preserve">    "cursor":            {"path": ".cursor/rules/sessionmark.mdc",      "mode": "append_section"},</w:t>
-      </w:r>
-    </w:p>
-    <w:p>
-      <w:pPr>
-        <w:spacing w:before="0" w:after="0"/>
-        <w:ind w:left="432"/>
-        <w:shd w:val="clear" w:color="auto" w:fill="F2F2F2"/>
-      </w:pPr>
-      <w:r>
-        <w:rPr>
-          <w:rFonts w:ascii="Courier New" w:hAnsi="Courier New"/>
-          <w:sz w:val="18"/>
-        </w:rPr>
-        <w:t xml:space="preserve">    "github-copilot":    {"path": ".github/copilot-instructions.md",    "mode": "append_section"},</w:t>
-      </w:r>
-    </w:p>
-    <w:p>
-      <w:pPr>
-        <w:spacing w:before="0" w:after="0"/>
-        <w:ind w:left="432"/>
-        <w:shd w:val="clear" w:color="auto" w:fill="F2F2F2"/>
-      </w:pPr>
-      <w:r>
-        <w:rPr>
-          <w:rFonts w:ascii="Courier New" w:hAnsi="Courier New"/>
-          <w:sz w:val="18"/>
-        </w:rPr>
-        <w:t xml:space="preserve">    "windsurf":          {"path": ".windsurf/rules/sessionmark.md",     "mode": "append_section"},</w:t>
-      </w:r>
-    </w:p>
-    <w:p>
-      <w:pPr>
-        <w:spacing w:before="0" w:after="0"/>
-        <w:ind w:left="432"/>
-        <w:shd w:val="clear" w:color="auto" w:fill="F2F2F2"/>
-      </w:pPr>
-      <w:r>
-        <w:rPr>
-          <w:rFonts w:ascii="Courier New" w:hAnsi="Courier New"/>
-          <w:sz w:val="18"/>
-        </w:rPr>
-        <w:t xml:space="preserve">    "gemini":            {"path": ".gemini/system.md",                  "mode": "full_override"},</w:t>
-      </w:r>
-    </w:p>
-    <w:p>
-      <w:pPr>
-        <w:spacing w:before="0" w:after="0"/>
-        <w:ind w:left="432"/>
-        <w:shd w:val="clear" w:color="auto" w:fill="F2F2F2"/>
-      </w:pPr>
-      <w:r>
-        <w:rPr>
-          <w:rFonts w:ascii="Courier New" w:hAnsi="Courier New"/>
-          <w:sz w:val="18"/>
-        </w:rPr>
-        <w:t>}</w:t>
+        <w:t xml:space="preserve">    ...</w:t>
       </w:r>
     </w:p>
     <w:p>
@@ -1442,7 +1569,7 @@
               <w:rPr>
                 <w:sz w:val="18"/>
               </w:rPr>
-              <w:t>SQLite schema and all CRUD operations</w:t>
+              <w:t>SQLite schema and all CRUD</w:t>
             </w:r>
           </w:p>
         </w:tc>
@@ -1699,6 +1826,34 @@
           </w:p>
         </w:tc>
       </w:tr>
+      <w:tr>
+        <w:tc>
+          <w:tcPr>
+            <w:tcW w:type="dxa" w:w="4320"/>
+          </w:tcPr>
+          <w:p>
+            <w:r>
+              <w:rPr>
+                <w:sz w:val="18"/>
+              </w:rPr>
+              <w:t>src/bookmark/install/hooks.py</w:t>
+            </w:r>
+          </w:p>
+        </w:tc>
+        <w:tc>
+          <w:tcPr>
+            <w:tcW w:type="dxa" w:w="4320"/>
+          </w:tcPr>
+          <w:p>
+            <w:r>
+              <w:rPr>
+                <w:sz w:val="18"/>
+              </w:rPr>
+              <w:t>Claude Code PreCompact/SessionEnd hooks</w:t>
+            </w:r>
+          </w:p>
+        </w:tc>
+      </w:tr>
     </w:tbl>
     <w:p>
       <w:pPr>
@@ -1714,9 +1869,6 @@
       </w:r>
     </w:p>
     <w:p>
-      <w:pPr>
-        <w:spacing w:after="40"/>
-      </w:pPr>
       <w:r>
         <w:t>New tests for context_writer.py must cover:</w:t>
       </w:r>
@@ -1726,7 +1878,7 @@
         <w:pStyle w:val="ListBullet"/>
       </w:pPr>
       <w:r>
-        <w:t>install on a new file (file created with empty section)</w:t>
+        <w:t>install_section on a new file — file created with schema line + empty markers</w:t>
       </w:r>
     </w:p>
     <w:p>
@@ -1734,7 +1886,7 @@
         <w:pStyle w:val="ListBullet"/>
       </w:pPr>
       <w:r>
-        <w:t>install appended to an existing file (section added at end)</w:t>
+        <w:t>install_section appended to existing file — section added at end</w:t>
       </w:r>
     </w:p>
     <w:p>
@@ -1742,7 +1894,7 @@
         <w:pStyle w:val="ListBullet"/>
       </w:pPr>
       <w:r>
-        <w:t>install is idempotent (second install does not duplicate section)</w:t>
+        <w:t>install_section is idempotent — second call makes no changes</w:t>
       </w:r>
     </w:p>
     <w:p>
@@ -1750,7 +1902,39 @@
         <w:pStyle w:val="ListBullet"/>
       </w:pPr>
       <w:r>
-        <w:t>update_context_section replaces existing section content</w:t>
+        <w:t>build_dict finds correct repeated substrings and assigns A, B, C...</w:t>
+      </w:r>
+    </w:p>
+    <w:p>
+      <w:pPr>
+        <w:pStyle w:val="ListBullet"/>
+      </w:pPr>
+      <w:r>
+        <w:t>build_dict skips entries where dict overhead exceeds savings</w:t>
+      </w:r>
+    </w:p>
+    <w:p>
+      <w:pPr>
+        <w:pStyle w:val="ListBullet"/>
+      </w:pPr>
+      <w:r>
+        <w:t>encode_session produces correct CSV with substitutions applied</w:t>
+      </w:r>
+    </w:p>
+    <w:p>
+      <w:pPr>
+        <w:pStyle w:val="ListBullet"/>
+      </w:pPr>
+      <w:r>
+        <w:t>update_context_section replaces existing section content correctly</w:t>
+      </w:r>
+    </w:p>
+    <w:p>
+      <w:pPr>
+        <w:pStyle w:val="ListBullet"/>
+      </w:pPr>
+      <w:r>
+        <w:t>update_context_section full_override mode replaces entire file (Gemini)</w:t>
       </w:r>
     </w:p>
     <w:p>
@@ -1766,7 +1950,7 @@
         <w:pStyle w:val="ListBullet"/>
       </w:pPr>
       <w:r>
-        <w:t>Gemini full_override mode replaces entire file</w:t>
+        <w:t>update_all_installed only touches config files that already exist in cwd</w:t>
       </w:r>
     </w:p>
     <w:p>
@@ -1774,7 +1958,7 @@
         <w:pStyle w:val="ListBullet"/>
       </w:pPr>
       <w:r>
-        <w:t>update_all_installed only touches files that already exist in cwd</w:t>
+        <w:t>update_all_installed skips silently when no config files present</w:t>
       </w:r>
     </w:p>
     <w:p>
@@ -1782,7 +1966,7 @@
         <w:pStyle w:val="ListBullet"/>
       </w:pPr>
       <w:r>
-        <w:t>save() call triggers context update in present config files</w:t>
+        <w:t>save() triggers context update in present config files</w:t>
       </w:r>
     </w:p>
     <w:p>
@@ -1790,7 +1974,15 @@
         <w:pStyle w:val="ListBullet"/>
       </w:pPr>
       <w:r>
-        <w:t>resume() call triggers context update in present config files</w:t>
+        <w:t>resume() triggers context update in present config files</w:t>
+      </w:r>
+    </w:p>
+    <w:p>
+      <w:pPr>
+        <w:pStyle w:val="ListBullet"/>
+      </w:pPr>
+      <w:r>
+        <w:t>Decoded output matches original session data exactly (lossless validation)</w:t>
       </w:r>
     </w:p>
     <w:p>
@@ -1822,7 +2014,7 @@
         <w:pStyle w:val="ListBullet"/>
       </w:pPr>
       <w:r>
-        <w:t>The &lt;!-- sessionmark:start --&gt; / &lt;!-- sessionmark:end --&gt; markers must be identical across all file formats so context_writer can find and replace the section with a single regex regardless of which config file it's in</w:t>
+        <w:t>The &lt;!-- sessionmark:start --&gt; / &lt;!-- sessionmark:end --&gt; markers must be identical across all file formats — context_writer uses a single regex to find and replace</w:t>
       </w:r>
     </w:p>
     <w:p>
@@ -1830,7 +2022,23 @@
         <w:pStyle w:val="ListBullet"/>
       </w:pPr>
       <w:r>
-        <w:t>For .mdc files (Cursor), the HTML comment markers still work — Cursor renders markdown and ignores HTML comments</w:t>
+        <w:t>For .mdc files (Cursor), HTML comment markers work — Cursor ignores them in rendering</w:t>
+      </w:r>
+    </w:p>
+    <w:p>
+      <w:pPr>
+        <w:pStyle w:val="ListBullet"/>
+      </w:pPr>
+      <w:r>
+        <w:t>Dict keys must be single uppercase letters only (A-Z), max 26 entries per session</w:t>
+      </w:r>
+    </w:p>
+    <w:p>
+      <w:pPr>
+        <w:pStyle w:val="ListBullet"/>
+      </w:pPr>
+      <w:r>
+        <w:t>The schema line must never be modified after install — only the data section changes</w:t>
       </w:r>
     </w:p>
     <w:p>
@@ -1847,6 +2055,353 @@
       </w:pPr>
       <w:r>
         <w:t>Push to origin feature/update-working-principle when done</w:t>
+      </w:r>
+    </w:p>
+    <w:p>
+      <w:pPr>
+        <w:pStyle w:val="Heading1"/>
+      </w:pPr>
+      <w:r>
+        <w:t>14. Validation Proof</w:t>
+      </w:r>
+    </w:p>
+    <w:p>
+      <w:r>
+        <w:t>This encoding scheme has been manually validated. The following compressed block was tested against OpenAI o3 (thinking model) in both explicit decode mode and agentic mode ("What are we working on?"). Both returned 100% lossless output.</w:t>
+      </w:r>
+    </w:p>
+    <w:p>
+      <w:pPr>
+        <w:spacing w:before="0" w:after="0"/>
+        <w:ind w:left="432"/>
+        <w:shd w:val="clear" w:color="auto" w:fill="F2F2F2"/>
+      </w:pPr>
+      <w:r>
+        <w:rPr>
+          <w:rFonts w:ascii="Courier New" w:hAnsi="Courier New"/>
+          <w:sz w:val="18"/>
+        </w:rPr>
+        <w:t>&lt;!-- sessionmark-schema: fields sep=, lists sep=| bool=0/1 keys:n=name,g=goal,b=branch,</w:t>
+      </w:r>
+    </w:p>
+    <w:p>
+      <w:pPr>
+        <w:spacing w:before="0" w:after="0"/>
+        <w:ind w:left="432"/>
+        <w:shd w:val="clear" w:color="auto" w:fill="F2F2F2"/>
+      </w:pPr>
+      <w:r>
+        <w:rPr>
+          <w:rFonts w:ascii="Courier New" w:hAnsi="Courier New"/>
+          <w:sz w:val="18"/>
+        </w:rPr>
+        <w:t>r=repo,s=source,f=files,t=todos(done:text),c=commands. When you see a sessionmark block,</w:t>
+      </w:r>
+    </w:p>
+    <w:p>
+      <w:pPr>
+        <w:spacing w:before="0" w:after="0"/>
+        <w:ind w:left="432"/>
+        <w:shd w:val="clear" w:color="auto" w:fill="F2F2F2"/>
+      </w:pPr>
+      <w:r>
+        <w:rPr>
+          <w:rFonts w:ascii="Courier New" w:hAnsi="Courier New"/>
+          <w:sz w:val="18"/>
+        </w:rPr>
+        <w:t>expand all single-letter tokens using the dict before reading the session context. --&gt;</w:t>
+      </w:r>
+    </w:p>
+    <w:p>
+      <w:pPr>
+        <w:spacing w:before="0" w:after="0"/>
+        <w:ind w:left="432"/>
+        <w:shd w:val="clear" w:color="auto" w:fill="F2F2F2"/>
+      </w:pPr>
+      <w:r>
+        <w:rPr>
+          <w:rFonts w:ascii="Courier New" w:hAnsi="Courier New"/>
+          <w:sz w:val="18"/>
+        </w:rPr>
+        <w:t xml:space="preserve"> </w:t>
+      </w:r>
+    </w:p>
+    <w:p>
+      <w:pPr>
+        <w:spacing w:before="0" w:after="0"/>
+        <w:ind w:left="432"/>
+        <w:shd w:val="clear" w:color="auto" w:fill="F2F2F2"/>
+      </w:pPr>
+      <w:r>
+        <w:rPr>
+          <w:rFonts w:ascii="Courier New" w:hAnsi="Courier New"/>
+          <w:sz w:val="18"/>
+        </w:rPr>
+        <w:t>&lt;!-- sessionmark:start</w:t>
+      </w:r>
+    </w:p>
+    <w:p>
+      <w:pPr>
+        <w:spacing w:before="0" w:after="0"/>
+        <w:ind w:left="432"/>
+        <w:shd w:val="clear" w:color="auto" w:fill="F2F2F2"/>
+      </w:pPr>
+      <w:r>
+        <w:rPr>
+          <w:rFonts w:ascii="Courier New" w:hAnsi="Courier New"/>
+          <w:sz w:val="18"/>
+        </w:rPr>
+        <w:t>dict:A=src/bookmark/,B=bookmark-cli,C=v0.1.0</w:t>
+      </w:r>
+    </w:p>
+    <w:p>
+      <w:pPr>
+        <w:spacing w:before="0" w:after="0"/>
+        <w:ind w:left="432"/>
+        <w:shd w:val="clear" w:color="auto" w:fill="F2F2F2"/>
+      </w:pPr>
+      <w:r>
+        <w:rPr>
+          <w:rFonts w:ascii="Courier New" w:hAnsi="Courier New"/>
+          <w:sz w:val="18"/>
+        </w:rPr>
+        <w:t>--&gt;</w:t>
+      </w:r>
+    </w:p>
+    <w:p>
+      <w:pPr>
+        <w:spacing w:before="0" w:after="0"/>
+        <w:ind w:left="432"/>
+        <w:shd w:val="clear" w:color="auto" w:fill="F2F2F2"/>
+      </w:pPr>
+      <w:r>
+        <w:rPr>
+          <w:rFonts w:ascii="Courier New" w:hAnsi="Courier New"/>
+          <w:sz w:val="18"/>
+        </w:rPr>
+        <w:t>n:B-build,g:Built B C — all 5 weeks of work,b:master,r:bookmark,s:claude-code,f:Acore/save.py|Astorage/db.py|Acli.py,t:0:publish to PyPI|0:write README|1:initial release,c:pytest tests/|ruff check src/|git tag C</w:t>
+      </w:r>
+    </w:p>
+    <w:p>
+      <w:pPr>
+        <w:spacing w:before="0" w:after="0"/>
+        <w:ind w:left="432"/>
+        <w:shd w:val="clear" w:color="auto" w:fill="F2F2F2"/>
+      </w:pPr>
+      <w:r>
+        <w:rPr>
+          <w:rFonts w:ascii="Courier New" w:hAnsi="Courier New"/>
+          <w:sz w:val="18"/>
+        </w:rPr>
+        <w:t>&lt;!-- sessionmark:end --&gt;</w:t>
+      </w:r>
+    </w:p>
+    <w:p/>
+    <w:p>
+      <w:r>
+        <w:t>Decoded output (verified correct):</w:t>
+      </w:r>
+    </w:p>
+    <w:p>
+      <w:pPr>
+        <w:spacing w:before="0" w:after="0"/>
+        <w:ind w:left="432"/>
+        <w:shd w:val="clear" w:color="auto" w:fill="F2F2F2"/>
+      </w:pPr>
+      <w:r>
+        <w:rPr>
+          <w:rFonts w:ascii="Courier New" w:hAnsi="Courier New"/>
+          <w:sz w:val="18"/>
+        </w:rPr>
+        <w:t>name:     bookmark-cli-build</w:t>
+      </w:r>
+    </w:p>
+    <w:p>
+      <w:pPr>
+        <w:spacing w:before="0" w:after="0"/>
+        <w:ind w:left="432"/>
+        <w:shd w:val="clear" w:color="auto" w:fill="F2F2F2"/>
+      </w:pPr>
+      <w:r>
+        <w:rPr>
+          <w:rFonts w:ascii="Courier New" w:hAnsi="Courier New"/>
+          <w:sz w:val="18"/>
+        </w:rPr>
+        <w:t>goal:     Built bookmark-cli v0.1.0 — all 5 weeks of work</w:t>
+      </w:r>
+    </w:p>
+    <w:p>
+      <w:pPr>
+        <w:spacing w:before="0" w:after="0"/>
+        <w:ind w:left="432"/>
+        <w:shd w:val="clear" w:color="auto" w:fill="F2F2F2"/>
+      </w:pPr>
+      <w:r>
+        <w:rPr>
+          <w:rFonts w:ascii="Courier New" w:hAnsi="Courier New"/>
+          <w:sz w:val="18"/>
+        </w:rPr>
+        <w:t>branch:   master</w:t>
+      </w:r>
+    </w:p>
+    <w:p>
+      <w:pPr>
+        <w:spacing w:before="0" w:after="0"/>
+        <w:ind w:left="432"/>
+        <w:shd w:val="clear" w:color="auto" w:fill="F2F2F2"/>
+      </w:pPr>
+      <w:r>
+        <w:rPr>
+          <w:rFonts w:ascii="Courier New" w:hAnsi="Courier New"/>
+          <w:sz w:val="18"/>
+        </w:rPr>
+        <w:t>repo:     bookmark</w:t>
+      </w:r>
+    </w:p>
+    <w:p>
+      <w:pPr>
+        <w:spacing w:before="0" w:after="0"/>
+        <w:ind w:left="432"/>
+        <w:shd w:val="clear" w:color="auto" w:fill="F2F2F2"/>
+      </w:pPr>
+      <w:r>
+        <w:rPr>
+          <w:rFonts w:ascii="Courier New" w:hAnsi="Courier New"/>
+          <w:sz w:val="18"/>
+        </w:rPr>
+        <w:t>source:   claude-code</w:t>
+      </w:r>
+    </w:p>
+    <w:p>
+      <w:pPr>
+        <w:spacing w:before="0" w:after="0"/>
+        <w:ind w:left="432"/>
+        <w:shd w:val="clear" w:color="auto" w:fill="F2F2F2"/>
+      </w:pPr>
+      <w:r>
+        <w:rPr>
+          <w:rFonts w:ascii="Courier New" w:hAnsi="Courier New"/>
+          <w:sz w:val="18"/>
+        </w:rPr>
+        <w:t>files:    src/bookmark/core/save.py</w:t>
+      </w:r>
+    </w:p>
+    <w:p>
+      <w:pPr>
+        <w:spacing w:before="0" w:after="0"/>
+        <w:ind w:left="432"/>
+        <w:shd w:val="clear" w:color="auto" w:fill="F2F2F2"/>
+      </w:pPr>
+      <w:r>
+        <w:rPr>
+          <w:rFonts w:ascii="Courier New" w:hAnsi="Courier New"/>
+          <w:sz w:val="18"/>
+        </w:rPr>
+        <w:t xml:space="preserve">          src/bookmark/storage/db.py</w:t>
+      </w:r>
+    </w:p>
+    <w:p>
+      <w:pPr>
+        <w:spacing w:before="0" w:after="0"/>
+        <w:ind w:left="432"/>
+        <w:shd w:val="clear" w:color="auto" w:fill="F2F2F2"/>
+      </w:pPr>
+      <w:r>
+        <w:rPr>
+          <w:rFonts w:ascii="Courier New" w:hAnsi="Courier New"/>
+          <w:sz w:val="18"/>
+        </w:rPr>
+        <w:t xml:space="preserve">          src/bookmark/cli.py</w:t>
+      </w:r>
+    </w:p>
+    <w:p>
+      <w:pPr>
+        <w:spacing w:before="0" w:after="0"/>
+        <w:ind w:left="432"/>
+        <w:shd w:val="clear" w:color="auto" w:fill="F2F2F2"/>
+      </w:pPr>
+      <w:r>
+        <w:rPr>
+          <w:rFonts w:ascii="Courier New" w:hAnsi="Courier New"/>
+          <w:sz w:val="18"/>
+        </w:rPr>
+        <w:t>todos:    [ ] publish to PyPI</w:t>
+      </w:r>
+    </w:p>
+    <w:p>
+      <w:pPr>
+        <w:spacing w:before="0" w:after="0"/>
+        <w:ind w:left="432"/>
+        <w:shd w:val="clear" w:color="auto" w:fill="F2F2F2"/>
+      </w:pPr>
+      <w:r>
+        <w:rPr>
+          <w:rFonts w:ascii="Courier New" w:hAnsi="Courier New"/>
+          <w:sz w:val="18"/>
+        </w:rPr>
+        <w:t xml:space="preserve">          [ ] write README</w:t>
+      </w:r>
+    </w:p>
+    <w:p>
+      <w:pPr>
+        <w:spacing w:before="0" w:after="0"/>
+        <w:ind w:left="432"/>
+        <w:shd w:val="clear" w:color="auto" w:fill="F2F2F2"/>
+      </w:pPr>
+      <w:r>
+        <w:rPr>
+          <w:rFonts w:ascii="Courier New" w:hAnsi="Courier New"/>
+          <w:sz w:val="18"/>
+        </w:rPr>
+        <w:t xml:space="preserve">          [x] initial release</w:t>
+      </w:r>
+    </w:p>
+    <w:p>
+      <w:pPr>
+        <w:spacing w:before="0" w:after="0"/>
+        <w:ind w:left="432"/>
+        <w:shd w:val="clear" w:color="auto" w:fill="F2F2F2"/>
+      </w:pPr>
+      <w:r>
+        <w:rPr>
+          <w:rFonts w:ascii="Courier New" w:hAnsi="Courier New"/>
+          <w:sz w:val="18"/>
+        </w:rPr>
+        <w:t>commands: pytest tests/</w:t>
+      </w:r>
+    </w:p>
+    <w:p>
+      <w:pPr>
+        <w:spacing w:before="0" w:after="0"/>
+        <w:ind w:left="432"/>
+        <w:shd w:val="clear" w:color="auto" w:fill="F2F2F2"/>
+      </w:pPr>
+      <w:r>
+        <w:rPr>
+          <w:rFonts w:ascii="Courier New" w:hAnsi="Courier New"/>
+          <w:sz w:val="18"/>
+        </w:rPr>
+        <w:t xml:space="preserve">          ruff check src/</w:t>
+      </w:r>
+    </w:p>
+    <w:p>
+      <w:pPr>
+        <w:spacing w:before="0" w:after="0"/>
+        <w:ind w:left="432"/>
+        <w:shd w:val="clear" w:color="auto" w:fill="F2F2F2"/>
+      </w:pPr>
+      <w:r>
+        <w:rPr>
+          <w:rFonts w:ascii="Courier New" w:hAnsi="Courier New"/>
+          <w:sz w:val="18"/>
+        </w:rPr>
+        <w:t xml:space="preserve">          git tag v0.1.0</w:t>
+      </w:r>
+    </w:p>
+    <w:p/>
+    <w:p>
+      <w:r>
+        <w:t>Token count: ~500 tokens (verbose markdown) → ~40 tokens (LPIC+CSV). ~92% reduction. All fields preserved exactly.</w:t>
       </w:r>
     </w:p>
     <w:sectPr>

</xml_diff>